<commit_message>
Switch to Qwen3.5-2B-Base: 4B OOMs on a T4 (fp32 fallback)
</commit_message>
<xml_diff>
--- a/REPORT.docx
+++ b/REPORT.docx
@@ -31,7 +31,7 @@
           <w:b w:val="0"/>
           <w:i w:val="0"/>
         </w:rPr>
-        <w:t xml:space="preserve"> Fine-tuning an open language model (Qwen3.5-4B-Base) to work as a general-practice (GP) style health assistant</w:t>
+        <w:t xml:space="preserve"> Fine-tuning an open language model (Qwen3.5-2B-Base) to work as a general-practice (GP) style health assistant</w:t>
       </w:r>
       <w:r>
         <w:br/>
@@ -1709,7 +1709,7 @@
           <w:i w:val="0"/>
           <w:sz w:val="19"/>
         </w:rPr>
-        <w:t>Qwen3.5-4B-Base</w:t>
+        <w:t>Qwen3.5-2B-Base</w:t>
       </w:r>
       <w:r>
         <w:rPr>
@@ -4503,7 +4503,7 @@
           <w:b w:val="0"/>
           <w:i w:val="0"/>
         </w:rPr>
-        <w:t xml:space="preserve"> We checked which models are current (September 2026): Qwen3.5 (released February 2026) has dense sizes 0.8B, 2B, 4B, 9B and 27B; Qwen3.8 exists but only as a 27B dense (too large for a T4) and larger models; no Qwen4 was announced. We chose </w:t>
+        <w:t xml:space="preserve"> We checked which models are current (September 2026): Qwen3.5 (released February 2026) has dense sizes 0.8B, 2B, 4B, 9B and 27B; Qwen3.8 exists but only as a 27B dense (too large for a T4) and larger models; no Qwen4 was announced. We first tried </w:t>
       </w:r>
       <w:r>
         <w:rPr>
@@ -4517,13 +4517,27 @@
           <w:b w:val="0"/>
           <w:i w:val="0"/>
         </w:rPr>
-        <w:t xml:space="preserve"> because it is the newest generation in a size that fits a free T4 with 16-bit LoRA (about 10 GB according to Unsloth's guidance). We use the </w:t>
+        <w:t xml:space="preserve"> (Unsloth's guidance suggested about 10 GB with 16-bit LoRA), but it ran out of memory on the T4: the T4 has no bfloat16, so Unsloth loads Qwen3.5 in float32, about 16 GB of weights on a 15 GB GPU. We therefore use </w:t>
       </w:r>
       <w:r>
         <w:rPr>
           <w:b/>
           <w:i w:val="0"/>
         </w:rPr>
+        <w:t>Qwen3.5-2B-Base</w:t>
+      </w:r>
+      <w:r>
+        <w:rPr>
+          <w:b w:val="0"/>
+          <w:i w:val="0"/>
+        </w:rPr>
+        <w:t xml:space="preserve">, the newest generation in a size that fits. We use the </w:t>
+      </w:r>
+      <w:r>
+        <w:rPr>
+          <w:b/>
+          <w:i w:val="0"/>
+        </w:rPr>
         <w:t>Base</w:t>
       </w:r>
       <w:r>
@@ -4531,7 +4545,7 @@
           <w:b w:val="0"/>
           <w:i w:val="0"/>
         </w:rPr>
-        <w:t xml:space="preserve"> variant, not the chat-tuned one, so Stage 2 is genuinely ours. The 2B-Base is the fallback if memory or time is short; 9B-Base is the upgrade on a bigger GPU.</w:t>
+        <w:t xml:space="preserve"> variant, not the chat-tuned one, so Stage 2 is genuinely ours. 4B-Base needs a GPU with bfloat16 (for example an L4 or A100); 9B-Base is the upgrade on a bigger GPU.</w:t>
       </w:r>
     </w:p>
     <w:p>
@@ -4750,7 +4764,7 @@
                 <w:i w:val="0"/>
                 <w:sz w:val="19"/>
               </w:rPr>
-              <w:t>Qwen3.5-4B-Base</w:t>
+              <w:t>Qwen3.5-2B-Base</w:t>
             </w:r>
             <w:r>
               <w:rPr>
@@ -4774,7 +4788,7 @@
                 <w:i w:val="0"/>
                 <w:sz w:val="18"/>
               </w:rPr>
-              <w:t xml:space="preserve"> 4-bit quantised training for Qwen3.5 because of larger quantisation error)</w:t>
+              <w:t xml:space="preserve"> 4-bit quantised training for Qwen3.5 because of larger quantisation error). On a T4 Unsloth falls back to float32; the 4B model ran out of memory (about 16 GB of weights on a 15 GB GPU), so we use 2B</w:t>
             </w:r>
           </w:p>
         </w:tc>
@@ -8544,7 +8558,7 @@
                 <w:i w:val="0"/>
                 <w:sz w:val="18"/>
               </w:rPr>
-              <w:t>Qwen3.5-4B-Base</w:t>
+              <w:t>Qwen3.5-2B-Base</w:t>
             </w:r>
           </w:p>
         </w:tc>
@@ -9188,7 +9202,7 @@
                 <w:i w:val="0"/>
                 <w:sz w:val="18"/>
               </w:rPr>
-              <w:t>A T4 cannot hold full fine-tuning of a 4B model; LoRA trains about a small fraction of the weights, uses little memory, and keeps the base intact.</w:t>
+              <w:t>A T4 cannot hold full fine-tuning of a multi-billion-parameter model; LoRA trains about a small fraction of the weights, uses little memory, and keeps the base intact.</w:t>
             </w:r>
           </w:p>
         </w:tc>

</xml_diff>